<commit_message>
Actualizar archivos de proyecto
</commit_message>
<xml_diff>
--- a/restrospectiva dopo proyecto (2).docx
+++ b/restrospectiva dopo proyecto (2).docx
@@ -12,21 +12,7 @@
         <w:rPr>
           <w:lang w:val="es-ES"/>
         </w:rPr>
-        <w:t xml:space="preserve">Julian </w:t>
-      </w:r>
-      <w:proofErr w:type="spellStart"/>
-      <w:r>
-        <w:rPr>
-          <w:lang w:val="es-ES"/>
-        </w:rPr>
-        <w:t>bohorquez</w:t>
-      </w:r>
-      <w:proofErr w:type="spellEnd"/>
-      <w:r>
-        <w:rPr>
-          <w:lang w:val="es-ES"/>
-        </w:rPr>
-        <w:t xml:space="preserve"> – samuel Lizarazo</w:t>
+        <w:t>Julian bohorquez – samuel Lizarazo</w:t>
       </w:r>
     </w:p>
     <w:p>
@@ -71,22 +57,185 @@
           <w:lang w:val="es-ES"/>
         </w:rPr>
       </w:pPr>
-      <w:proofErr w:type="gramStart"/>
       <w:r>
         <w:rPr>
           <w:lang w:val="es-ES"/>
         </w:rPr>
         <w:t>1 )</w:t>
       </w:r>
-      <w:proofErr w:type="gramEnd"/>
-      <w:r>
-        <w:rPr>
-          <w:rFonts w:ascii="Segoe UI" w:hAnsi="Segoe UI" w:cs="Segoe UI"/>
-          <w:color w:val="0D0D0D"/>
-          <w:shd w:val="clear" w:color="auto" w:fill="FFFFFF"/>
-          <w:lang w:val="es-ES"/>
-        </w:rPr>
-        <w:t xml:space="preserve"> Primero hicimos las clases principales, luego las funciones de ruedas y símbolos, después los giros y la lógica de ganador. Finalmente agregamos la parte gráfica y las pruebas. Los dividimos así para avanzar poco a poco y detectar errores rápido</w:t>
+      <w:r>
+        <w:rPr>
+          <w:rFonts w:ascii="Segoe UI" w:hAnsi="Segoe UI" w:cs="Segoe UI"/>
+          <w:color w:val="0D0D0D"/>
+          <w:shd w:val="clear" w:color="auto" w:fill="FFFFFF"/>
+          <w:lang w:val="es-ES"/>
+        </w:rPr>
+        <w:t xml:space="preserve"> </w:t>
+      </w:r>
+      <w:r>
+        <w:rPr>
+          <w:rFonts w:ascii="Segoe UI" w:hAnsi="Segoe UI" w:cs="Segoe UI"/>
+          <w:color w:val="0D0D0D"/>
+          <w:shd w:val="clear" w:color="auto" w:fill="FFFFFF"/>
+          <w:lang w:val="es-ES"/>
+        </w:rPr>
+        <w:t xml:space="preserve">Definimos </w:t>
+      </w:r>
+      <w:r>
+        <w:rPr>
+          <w:rFonts w:ascii="Segoe UI" w:hAnsi="Segoe UI" w:cs="Segoe UI"/>
+          <w:color w:val="0D0D0D"/>
+          <w:shd w:val="clear" w:color="auto" w:fill="FFFFFF"/>
+          <w:lang w:val="es-ES"/>
+        </w:rPr>
+        <w:t>3</w:t>
+      </w:r>
+      <w:r>
+        <w:rPr>
+          <w:rFonts w:ascii="Segoe UI" w:hAnsi="Segoe UI" w:cs="Segoe UI"/>
+          <w:color w:val="0D0D0D"/>
+          <w:shd w:val="clear" w:color="auto" w:fill="FFFFFF"/>
+          <w:lang w:val="es-ES"/>
+        </w:rPr>
+        <w:t xml:space="preserve"> miniciclos</w:t>
+      </w:r>
+      <w:r>
+        <w:rPr>
+          <w:rFonts w:ascii="Segoe UI" w:hAnsi="Segoe UI" w:cs="Segoe UI"/>
+          <w:color w:val="0D0D0D"/>
+          <w:shd w:val="clear" w:color="auto" w:fill="FFFFFF"/>
+          <w:lang w:val="es-ES"/>
+        </w:rPr>
+        <w:t>:</w:t>
+      </w:r>
+    </w:p>
+    <w:p>
+      <w:pPr>
+        <w:rPr>
+          <w:rFonts w:ascii="Segoe UI" w:hAnsi="Segoe UI" w:cs="Segoe UI"/>
+          <w:color w:val="0D0D0D"/>
+          <w:shd w:val="clear" w:color="auto" w:fill="FFFFFF"/>
+          <w:lang w:val="es-CO"/>
+        </w:rPr>
+      </w:pPr>
+      <w:r>
+        <w:rPr>
+          <w:rFonts w:ascii="Segoe UI" w:hAnsi="Segoe UI" w:cs="Segoe UI"/>
+          <w:color w:val="0D0D0D"/>
+          <w:shd w:val="clear" w:color="auto" w:fill="FFFFFF"/>
+          <w:lang w:val="es-ES"/>
+        </w:rPr>
+        <w:t>MiniCiclo1</w:t>
+      </w:r>
+      <w:r>
+        <w:rPr>
+          <w:rFonts w:ascii="Segoe UI" w:hAnsi="Segoe UI" w:cs="Segoe UI"/>
+          <w:color w:val="0D0D0D"/>
+          <w:shd w:val="clear" w:color="auto" w:fill="FFFFFF"/>
+          <w:lang w:val="es-CO"/>
+        </w:rPr>
+        <w:t>:</w:t>
+      </w:r>
+      <w:r>
+        <w:rPr>
+          <w:rFonts w:ascii="Segoe UI" w:hAnsi="Segoe UI" w:cs="Segoe UI"/>
+          <w:color w:val="0D0D0D"/>
+          <w:shd w:val="clear" w:color="auto" w:fill="FFFFFF"/>
+          <w:lang w:val="es-CO"/>
+        </w:rPr>
+        <w:t xml:space="preserve"> </w:t>
+      </w:r>
+      <w:r>
+        <w:rPr>
+          <w:rFonts w:ascii="Segoe UI" w:hAnsi="Segoe UI" w:cs="Segoe UI"/>
+          <w:color w:val="0D0D0D"/>
+          <w:shd w:val="clear" w:color="auto" w:fill="FFFFFF"/>
+          <w:lang w:val="es-CO"/>
+        </w:rPr>
+        <w:t xml:space="preserve">Diseñar e implementar </w:t>
+      </w:r>
+      <w:r>
+        <w:rPr>
+          <w:rFonts w:ascii="Segoe UI" w:hAnsi="Segoe UI" w:cs="Segoe UI"/>
+          <w:color w:val="0D0D0D"/>
+          <w:shd w:val="clear" w:color="auto" w:fill="FFFFFF"/>
+          <w:lang w:val="es-CO"/>
+        </w:rPr>
+        <w:t>Lock y unlock a una rueda, debido a que es lo más básico que es pedido en el miniciclo 2</w:t>
+      </w:r>
+      <w:r>
+        <w:rPr>
+          <w:rFonts w:ascii="Segoe UI" w:hAnsi="Segoe UI" w:cs="Segoe UI"/>
+          <w:color w:val="0D0D0D"/>
+          <w:shd w:val="clear" w:color="auto" w:fill="FFFFFF"/>
+          <w:lang w:val="es-CO"/>
+        </w:rPr>
+        <w:t>, ademas que posteriormente los métodos trabajados estarán relacionados con estos dos estados de una rueda.</w:t>
+      </w:r>
+    </w:p>
+    <w:p>
+      <w:pPr>
+        <w:rPr>
+          <w:rFonts w:ascii="Segoe UI" w:hAnsi="Segoe UI" w:cs="Segoe UI"/>
+          <w:color w:val="0D0D0D"/>
+          <w:shd w:val="clear" w:color="auto" w:fill="FFFFFF"/>
+          <w:lang w:val="es-CO"/>
+        </w:rPr>
+      </w:pPr>
+      <w:r>
+        <w:rPr>
+          <w:rFonts w:ascii="Segoe UI" w:hAnsi="Segoe UI" w:cs="Segoe UI"/>
+          <w:color w:val="0D0D0D"/>
+          <w:shd w:val="clear" w:color="auto" w:fill="FFFFFF"/>
+          <w:lang w:val="es-CO"/>
+        </w:rPr>
+        <w:t xml:space="preserve">MiniCiclo2: </w:t>
+      </w:r>
+      <w:r>
+        <w:rPr>
+          <w:rFonts w:ascii="Segoe UI" w:hAnsi="Segoe UI" w:cs="Segoe UI"/>
+          <w:color w:val="0D0D0D"/>
+          <w:shd w:val="clear" w:color="auto" w:fill="FFFFFF"/>
+          <w:lang w:val="es-CO"/>
+        </w:rPr>
+        <w:t>Diseñar e implementar swap</w:t>
+      </w:r>
+      <w:r>
+        <w:rPr>
+          <w:rFonts w:ascii="Segoe UI" w:hAnsi="Segoe UI" w:cs="Segoe UI"/>
+          <w:color w:val="0D0D0D"/>
+          <w:shd w:val="clear" w:color="auto" w:fill="FFFFFF"/>
+          <w:lang w:val="es-CO"/>
+        </w:rPr>
+        <w:t xml:space="preserve"> entre ruedas</w:t>
+      </w:r>
+    </w:p>
+    <w:p>
+      <w:pPr>
+        <w:rPr>
+          <w:rFonts w:ascii="Segoe UI" w:hAnsi="Segoe UI" w:cs="Segoe UI"/>
+          <w:color w:val="0D0D0D"/>
+          <w:shd w:val="clear" w:color="auto" w:fill="FFFFFF"/>
+          <w:lang w:val="es-CO"/>
+        </w:rPr>
+      </w:pPr>
+      <w:r>
+        <w:rPr>
+          <w:rFonts w:ascii="Segoe UI" w:hAnsi="Segoe UI" w:cs="Segoe UI"/>
+          <w:color w:val="0D0D0D"/>
+          <w:shd w:val="clear" w:color="auto" w:fill="FFFFFF"/>
+          <w:lang w:val="es-CO"/>
+        </w:rPr>
+        <w:t xml:space="preserve">MiniCiclo3: </w:t>
+      </w:r>
+      <w:r>
+        <w:rPr>
+          <w:rFonts w:ascii="Segoe UI" w:hAnsi="Segoe UI" w:cs="Segoe UI"/>
+          <w:color w:val="0D0D0D"/>
+          <w:shd w:val="clear" w:color="auto" w:fill="FFFFFF"/>
+          <w:lang w:val="es-CO"/>
+        </w:rPr>
+        <w:t xml:space="preserve"> Diseñar e implementar los dos nuevos métodos de spin</w:t>
       </w:r>
     </w:p>
     <w:p>
@@ -114,133 +263,193 @@
           <w:shd w:val="clear" w:color="auto" w:fill="FFFFFF"/>
           <w:lang w:val="es-ES"/>
         </w:rPr>
-        <w:t xml:space="preserve"> Los mini-ciclos principales están terminados. El programa funciona y ya hicimos pruebas de las funciones principales. </w:t>
-      </w:r>
-      <w:r>
-        <w:rPr>
-          <w:rFonts w:ascii="Segoe UI" w:hAnsi="Segoe UI" w:cs="Segoe UI"/>
-          <w:color w:val="0D0D0D"/>
-          <w:shd w:val="clear" w:color="auto" w:fill="FFFFFF"/>
-          <w:lang w:val="es-CO"/>
-        </w:rPr>
-        <w:t>Solo queda la revisión final</w:t>
-      </w:r>
-    </w:p>
-    <w:p>
-      <w:pPr>
-        <w:rPr>
-          <w:rFonts w:ascii="Segoe UI" w:hAnsi="Segoe UI" w:cs="Segoe UI"/>
-          <w:color w:val="0D0D0D"/>
-          <w:shd w:val="clear" w:color="auto" w:fill="FFFFFF"/>
-          <w:lang w:val="es-CO"/>
-        </w:rPr>
-      </w:pPr>
-      <w:r>
-        <w:rPr>
-          <w:rFonts w:ascii="Segoe UI" w:hAnsi="Segoe UI" w:cs="Segoe UI"/>
-          <w:color w:val="0D0D0D"/>
-          <w:shd w:val="clear" w:color="auto" w:fill="FFFFFF"/>
-          <w:lang w:val="es-CO"/>
-        </w:rPr>
-        <w:t xml:space="preserve">3)Julian </w:t>
-      </w:r>
-      <w:proofErr w:type="spellStart"/>
-      <w:r>
-        <w:rPr>
-          <w:rFonts w:ascii="Segoe UI" w:hAnsi="Segoe UI" w:cs="Segoe UI"/>
-          <w:color w:val="0D0D0D"/>
-          <w:shd w:val="clear" w:color="auto" w:fill="FFFFFF"/>
-          <w:lang w:val="es-CO"/>
-        </w:rPr>
-        <w:t>bohorquez</w:t>
-      </w:r>
-      <w:proofErr w:type="spellEnd"/>
-      <w:r>
-        <w:rPr>
-          <w:rFonts w:ascii="Segoe UI" w:hAnsi="Segoe UI" w:cs="Segoe UI"/>
-          <w:color w:val="0D0D0D"/>
-          <w:shd w:val="clear" w:color="auto" w:fill="FFFFFF"/>
-          <w:lang w:val="es-CO"/>
-        </w:rPr>
-        <w:t xml:space="preserve"> = 9 horas</w:t>
-      </w:r>
-    </w:p>
-    <w:p>
-      <w:pPr>
-        <w:rPr>
-          <w:rFonts w:ascii="Segoe UI" w:hAnsi="Segoe UI" w:cs="Segoe UI"/>
-          <w:color w:val="0D0D0D"/>
-          <w:shd w:val="clear" w:color="auto" w:fill="FFFFFF"/>
-          <w:lang w:val="es-CO"/>
-        </w:rPr>
-      </w:pPr>
-      <w:r>
-        <w:rPr>
-          <w:rFonts w:ascii="Segoe UI" w:hAnsi="Segoe UI" w:cs="Segoe UI"/>
-          <w:color w:val="0D0D0D"/>
-          <w:shd w:val="clear" w:color="auto" w:fill="FFFFFF"/>
-          <w:lang w:val="es-CO"/>
-        </w:rPr>
-        <w:t>Samuel Lizarazo =9,5 horas</w:t>
-      </w:r>
-    </w:p>
-    <w:p>
-      <w:pPr>
-        <w:rPr>
-          <w:rFonts w:ascii="Segoe UI" w:hAnsi="Segoe UI" w:cs="Segoe UI"/>
-          <w:color w:val="0D0D0D"/>
-          <w:shd w:val="clear" w:color="auto" w:fill="FFFFFF"/>
-          <w:lang w:val="es-CO"/>
-        </w:rPr>
-      </w:pPr>
-    </w:p>
-    <w:p>
-      <w:pPr>
-        <w:rPr>
-          <w:rFonts w:ascii="Segoe UI" w:hAnsi="Segoe UI" w:cs="Segoe UI"/>
-          <w:color w:val="0D0D0D"/>
-          <w:shd w:val="clear" w:color="auto" w:fill="FFFFFF"/>
-          <w:lang w:val="es-ES"/>
-        </w:rPr>
-      </w:pPr>
-      <w:r>
-        <w:rPr>
-          <w:rFonts w:ascii="Segoe UI" w:hAnsi="Segoe UI" w:cs="Segoe UI"/>
-          <w:color w:val="0D0D0D"/>
-          <w:shd w:val="clear" w:color="auto" w:fill="FFFFFF"/>
-          <w:lang w:val="es-ES"/>
-        </w:rPr>
-        <w:t>4) Logramos integrar todas las clases y conseguir que la máquina funcionara correctamente, incluyendo los giro</w:t>
-      </w:r>
-      <w:r>
-        <w:rPr>
-          <w:rFonts w:ascii="Segoe UI" w:hAnsi="Segoe UI" w:cs="Segoe UI"/>
-          <w:color w:val="0D0D0D"/>
-          <w:shd w:val="clear" w:color="auto" w:fill="FFFFFF"/>
-          <w:lang w:val="es-ES"/>
-        </w:rPr>
-        <w:t xml:space="preserve">s y que se viera quien era </w:t>
-      </w:r>
-      <w:proofErr w:type="gramStart"/>
-      <w:r>
-        <w:rPr>
-          <w:rFonts w:ascii="Segoe UI" w:hAnsi="Segoe UI" w:cs="Segoe UI"/>
-          <w:color w:val="0D0D0D"/>
-          <w:shd w:val="clear" w:color="auto" w:fill="FFFFFF"/>
-          <w:lang w:val="es-ES"/>
-        </w:rPr>
-        <w:t xml:space="preserve">el </w:t>
-      </w:r>
-      <w:r>
-        <w:rPr>
-          <w:rFonts w:ascii="Segoe UI" w:hAnsi="Segoe UI" w:cs="Segoe UI"/>
-          <w:color w:val="0D0D0D"/>
-          <w:shd w:val="clear" w:color="auto" w:fill="FFFFFF"/>
-          <w:lang w:val="es-ES"/>
-        </w:rPr>
-        <w:t xml:space="preserve"> ganador</w:t>
-      </w:r>
-      <w:proofErr w:type="gramEnd"/>
+        <w:t xml:space="preserve"> No están completos en su totalidad, </w:t>
+      </w:r>
+      <w:r>
+        <w:rPr>
+          <w:rFonts w:ascii="Segoe UI" w:hAnsi="Segoe UI" w:cs="Segoe UI"/>
+          <w:color w:val="0D0D0D"/>
+          <w:shd w:val="clear" w:color="auto" w:fill="FFFFFF"/>
+          <w:lang w:val="es-ES"/>
+        </w:rPr>
+        <w:t xml:space="preserve">hacen falta diagramas de secuencia que expliquen el funcionamiento de los métodos spin </w:t>
+      </w:r>
+      <w:r>
+        <w:rPr>
+          <w:rFonts w:ascii="Segoe UI" w:hAnsi="Segoe UI" w:cs="Segoe UI"/>
+          <w:color w:val="0D0D0D"/>
+          <w:shd w:val="clear" w:color="auto" w:fill="FFFFFF"/>
+          <w:lang w:val="es-ES"/>
+        </w:rPr>
+        <w:t xml:space="preserve">nuevos. </w:t>
+      </w:r>
+    </w:p>
+    <w:p>
+      <w:pPr>
+        <w:rPr>
+          <w:rFonts w:ascii="Segoe UI" w:hAnsi="Segoe UI" w:cs="Segoe UI"/>
+          <w:color w:val="0D0D0D"/>
+          <w:shd w:val="clear" w:color="auto" w:fill="FFFFFF"/>
+          <w:lang w:val="es-CO"/>
+        </w:rPr>
+      </w:pPr>
+      <w:r>
+        <w:rPr>
+          <w:rFonts w:ascii="Segoe UI" w:hAnsi="Segoe UI" w:cs="Segoe UI"/>
+          <w:color w:val="0D0D0D"/>
+          <w:shd w:val="clear" w:color="auto" w:fill="FFFFFF"/>
+          <w:lang w:val="es-CO"/>
+        </w:rPr>
+        <w:t>3)</w:t>
+      </w:r>
+    </w:p>
+    <w:p>
+      <w:pPr>
+        <w:rPr>
+          <w:rFonts w:ascii="Segoe UI" w:hAnsi="Segoe UI" w:cs="Segoe UI"/>
+          <w:color w:val="0D0D0D"/>
+          <w:shd w:val="clear" w:color="auto" w:fill="FFFFFF"/>
+          <w:lang w:val="es-CO"/>
+        </w:rPr>
+      </w:pPr>
+      <w:r>
+        <w:rPr>
+          <w:rFonts w:ascii="Segoe UI" w:hAnsi="Segoe UI" w:cs="Segoe UI"/>
+          <w:color w:val="0D0D0D"/>
+          <w:shd w:val="clear" w:color="auto" w:fill="FFFFFF"/>
+          <w:lang w:val="es-CO"/>
+        </w:rPr>
+        <w:t xml:space="preserve">Julian bohorquez = </w:t>
+      </w:r>
+      <w:r>
+        <w:rPr>
+          <w:rFonts w:ascii="Segoe UI" w:hAnsi="Segoe UI" w:cs="Segoe UI"/>
+          <w:color w:val="0D0D0D"/>
+          <w:shd w:val="clear" w:color="auto" w:fill="FFFFFF"/>
+          <w:lang w:val="es-CO"/>
+        </w:rPr>
+        <w:t>11,5</w:t>
+      </w:r>
+      <w:r>
+        <w:rPr>
+          <w:rFonts w:ascii="Segoe UI" w:hAnsi="Segoe UI" w:cs="Segoe UI"/>
+          <w:color w:val="0D0D0D"/>
+          <w:shd w:val="clear" w:color="auto" w:fill="FFFFFF"/>
+          <w:lang w:val="es-CO"/>
+        </w:rPr>
+        <w:t xml:space="preserve"> horas</w:t>
+      </w:r>
+    </w:p>
+    <w:p>
+      <w:pPr>
+        <w:rPr>
+          <w:rFonts w:ascii="Segoe UI" w:hAnsi="Segoe UI" w:cs="Segoe UI"/>
+          <w:color w:val="0D0D0D"/>
+          <w:shd w:val="clear" w:color="auto" w:fill="FFFFFF"/>
+          <w:lang w:val="es-CO"/>
+        </w:rPr>
+      </w:pPr>
+      <w:r>
+        <w:rPr>
+          <w:rFonts w:ascii="Segoe UI" w:hAnsi="Segoe UI" w:cs="Segoe UI"/>
+          <w:color w:val="0D0D0D"/>
+          <w:shd w:val="clear" w:color="auto" w:fill="FFFFFF"/>
+          <w:lang w:val="es-CO"/>
+        </w:rPr>
+        <w:t>Samuel Lizarazo =9 horas</w:t>
+      </w:r>
+    </w:p>
+    <w:p>
+      <w:pPr>
+        <w:rPr>
+          <w:rFonts w:ascii="Segoe UI" w:hAnsi="Segoe UI" w:cs="Segoe UI"/>
+          <w:color w:val="0D0D0D"/>
+          <w:shd w:val="clear" w:color="auto" w:fill="FFFFFF"/>
+          <w:lang w:val="es-CO"/>
+        </w:rPr>
+      </w:pPr>
+    </w:p>
+    <w:p>
+      <w:pPr>
+        <w:rPr>
+          <w:rFonts w:ascii="Segoe UI" w:hAnsi="Segoe UI" w:cs="Segoe UI"/>
+          <w:color w:val="0D0D0D"/>
+          <w:shd w:val="clear" w:color="auto" w:fill="FFFFFF"/>
+          <w:lang w:val="es-ES"/>
+        </w:rPr>
+      </w:pPr>
+      <w:r>
+        <w:rPr>
+          <w:rFonts w:ascii="Segoe UI" w:hAnsi="Segoe UI" w:cs="Segoe UI"/>
+          <w:color w:val="0D0D0D"/>
+          <w:shd w:val="clear" w:color="auto" w:fill="FFFFFF"/>
+          <w:lang w:val="es-ES"/>
+        </w:rPr>
+        <w:t xml:space="preserve">4) </w:t>
+      </w:r>
+      <w:r>
+        <w:rPr>
+          <w:rFonts w:ascii="Segoe UI" w:hAnsi="Segoe UI" w:cs="Segoe UI"/>
+          <w:color w:val="0D0D0D"/>
+          <w:shd w:val="clear" w:color="auto" w:fill="FFFFFF"/>
+          <w:lang w:val="es-ES"/>
+        </w:rPr>
+        <w:t xml:space="preserve">Consideramos que el mayor logro fue aplicar una de las correcciones </w:t>
+      </w:r>
+      <w:r>
+        <w:rPr>
+          <w:rFonts w:ascii="Segoe UI" w:hAnsi="Segoe UI" w:cs="Segoe UI"/>
+          <w:color w:val="0D0D0D"/>
+          <w:shd w:val="clear" w:color="auto" w:fill="FFFFFF"/>
+          <w:lang w:val="es-ES"/>
+        </w:rPr>
+        <w:t>más</w:t>
+      </w:r>
+      <w:r>
+        <w:rPr>
+          <w:rFonts w:ascii="Segoe UI" w:hAnsi="Segoe UI" w:cs="Segoe UI"/>
+          <w:color w:val="0D0D0D"/>
+          <w:shd w:val="clear" w:color="auto" w:fill="FFFFFF"/>
+          <w:lang w:val="es-ES"/>
+        </w:rPr>
+        <w:t xml:space="preserve"> importantes</w:t>
+      </w:r>
+      <w:r>
+        <w:rPr>
+          <w:rFonts w:ascii="Segoe UI" w:hAnsi="Segoe UI" w:cs="Segoe UI"/>
+          <w:color w:val="0D0D0D"/>
+          <w:shd w:val="clear" w:color="auto" w:fill="FFFFFF"/>
+          <w:lang w:val="es-ES"/>
+        </w:rPr>
+        <w:t xml:space="preserve"> al código general que era cambiar la estructura de datos en la que estábamos operando la slotMachine siendo un array, por lo que </w:t>
+      </w:r>
+      <w:r>
+        <w:rPr>
+          <w:rFonts w:ascii="Segoe UI" w:hAnsi="Segoe UI" w:cs="Segoe UI"/>
+          <w:color w:val="0D0D0D"/>
+          <w:shd w:val="clear" w:color="auto" w:fill="FFFFFF"/>
+          <w:lang w:val="es-ES"/>
+        </w:rPr>
+        <w:t xml:space="preserve">no estábamos sacando el mayor </w:t>
+      </w:r>
+      <w:r>
+        <w:rPr>
+          <w:rFonts w:ascii="Segoe UI" w:hAnsi="Segoe UI" w:cs="Segoe UI"/>
+          <w:color w:val="0D0D0D"/>
+          <w:shd w:val="clear" w:color="auto" w:fill="FFFFFF"/>
+          <w:lang w:val="es-ES"/>
+        </w:rPr>
+        <w:t>provecho a</w:t>
+      </w:r>
+      <w:r>
+        <w:rPr>
+          <w:rFonts w:ascii="Segoe UI" w:hAnsi="Segoe UI" w:cs="Segoe UI"/>
+          <w:color w:val="0D0D0D"/>
+          <w:shd w:val="clear" w:color="auto" w:fill="FFFFFF"/>
+          <w:lang w:val="es-ES"/>
+        </w:rPr>
+        <w:t xml:space="preserve"> la memoria de la maquina </w:t>
+      </w:r>
     </w:p>
     <w:p>
       <w:pPr>
@@ -267,7 +476,25 @@
           <w:shd w:val="clear" w:color="auto" w:fill="FFFFFF"/>
           <w:lang w:val="es-ES"/>
         </w:rPr>
-        <w:t>Tuvimos varios errores al conectar las clases y la parte gráfica. Los solucionamos probando cada parte por separado y corrigiendo los errores hasta que compilara y funcionara</w:t>
+        <w:t xml:space="preserve">Consideramos que la creación de diagramas se secuencia sigue siendo la falencia mas importante del proyecto </w:t>
+      </w:r>
+      <w:r>
+        <w:rPr>
+          <w:rFonts w:ascii="Segoe UI" w:hAnsi="Segoe UI" w:cs="Segoe UI"/>
+          <w:color w:val="0D0D0D"/>
+          <w:shd w:val="clear" w:color="auto" w:fill="FFFFFF"/>
+          <w:lang w:val="es-ES"/>
+        </w:rPr>
+        <w:t xml:space="preserve">ya que ninguno de las dos cuenta con un conocimiento </w:t>
+      </w:r>
+      <w:r>
+        <w:rPr>
+          <w:rFonts w:ascii="Segoe UI" w:hAnsi="Segoe UI" w:cs="Segoe UI"/>
+          <w:color w:val="0D0D0D"/>
+          <w:shd w:val="clear" w:color="auto" w:fill="FFFFFF"/>
+          <w:lang w:val="es-ES"/>
+        </w:rPr>
+        <w:t>necesario para hacer los diagramas de secuencia mas complicados.</w:t>
       </w:r>
     </w:p>
     <w:p>
@@ -295,82 +522,44 @@
           <w:shd w:val="clear" w:color="auto" w:fill="FFFFFF"/>
           <w:lang w:val="es-ES"/>
         </w:rPr>
-        <w:t xml:space="preserve"> Trabajamos bien en equipo y nos ayudamos cuando </w:t>
-      </w:r>
-      <w:r>
-        <w:rPr>
-          <w:rFonts w:ascii="Segoe UI" w:hAnsi="Segoe UI" w:cs="Segoe UI"/>
-          <w:color w:val="0D0D0D"/>
-          <w:shd w:val="clear" w:color="auto" w:fill="FFFFFF"/>
-          <w:lang w:val="es-ES"/>
-        </w:rPr>
-        <w:t xml:space="preserve">aparecieron problemas., sobretodo en el sentido de la automatización de </w:t>
-      </w:r>
-      <w:proofErr w:type="gramStart"/>
-      <w:r>
-        <w:rPr>
-          <w:rFonts w:ascii="Segoe UI" w:hAnsi="Segoe UI" w:cs="Segoe UI"/>
-          <w:color w:val="0D0D0D"/>
-          <w:shd w:val="clear" w:color="auto" w:fill="FFFFFF"/>
-          <w:lang w:val="es-ES"/>
-        </w:rPr>
-        <w:t xml:space="preserve">código </w:t>
-      </w:r>
-      <w:r>
-        <w:rPr>
-          <w:rFonts w:ascii="Segoe UI" w:hAnsi="Segoe UI" w:cs="Segoe UI"/>
-          <w:color w:val="0D0D0D"/>
-          <w:shd w:val="clear" w:color="auto" w:fill="FFFFFF"/>
-          <w:lang w:val="es-ES"/>
-        </w:rPr>
-        <w:t>,</w:t>
-      </w:r>
-      <w:proofErr w:type="gramEnd"/>
-      <w:r>
-        <w:rPr>
-          <w:rFonts w:ascii="Segoe UI" w:hAnsi="Segoe UI" w:cs="Segoe UI"/>
-          <w:color w:val="0D0D0D"/>
-          <w:shd w:val="clear" w:color="auto" w:fill="FFFFFF"/>
-          <w:lang w:val="es-ES"/>
-        </w:rPr>
-        <w:t xml:space="preserve"> y también en la unión de los diagramas la parte visual para la guía de “vista” </w:t>
-      </w:r>
-    </w:p>
-    <w:p>
-      <w:pPr>
-        <w:rPr>
-          <w:rFonts w:ascii="Segoe UI" w:hAnsi="Segoe UI" w:cs="Segoe UI"/>
-          <w:color w:val="0D0D0D"/>
-          <w:shd w:val="clear" w:color="auto" w:fill="FFFFFF"/>
-          <w:lang w:val="es-ES"/>
-        </w:rPr>
-      </w:pPr>
-      <w:r>
-        <w:rPr>
-          <w:rFonts w:ascii="Segoe UI" w:hAnsi="Segoe UI" w:cs="Segoe UI"/>
-          <w:color w:val="0D0D0D"/>
-          <w:shd w:val="clear" w:color="auto" w:fill="FFFFFF"/>
-          <w:lang w:val="es-ES"/>
-        </w:rPr>
-        <w:t xml:space="preserve">7)nosotros creemos que </w:t>
-      </w:r>
-      <w:r>
-        <w:rPr>
-          <w:rFonts w:ascii="Segoe UI" w:hAnsi="Segoe UI" w:cs="Segoe UI"/>
-          <w:color w:val="0D0D0D"/>
-          <w:shd w:val="clear" w:color="auto" w:fill="FFFFFF"/>
-          <w:lang w:val="es-ES"/>
-        </w:rPr>
-        <w:t>Las pruebas frecuentes fueron las más útiles porque nos permitieron encontrar errores rápidamente y corregirlos antes de continuar</w:t>
-      </w:r>
-      <w:r>
-        <w:rPr>
-          <w:rFonts w:ascii="Segoe UI" w:hAnsi="Segoe UI" w:cs="Segoe UI"/>
-          <w:color w:val="0D0D0D"/>
-          <w:shd w:val="clear" w:color="auto" w:fill="FFFFFF"/>
-          <w:lang w:val="es-ES"/>
-        </w:rPr>
-        <w:t xml:space="preserve"> para no seguir con los errores</w:t>
+        <w:t xml:space="preserve"> </w:t>
+      </w:r>
+      <w:r>
+        <w:rPr>
+          <w:rFonts w:ascii="Segoe UI" w:hAnsi="Segoe UI" w:cs="Segoe UI"/>
+          <w:color w:val="0D0D0D"/>
+          <w:shd w:val="clear" w:color="auto" w:fill="FFFFFF"/>
+          <w:lang w:val="es-ES"/>
+        </w:rPr>
+        <w:t>Dejamos de dividir el trabajo y empezamos a trabajar ambos en todos los aspectos del proyecto, código, diseño y creación de pruebas.</w:t>
+      </w:r>
+    </w:p>
+    <w:p>
+      <w:pPr>
+        <w:rPr>
+          <w:rFonts w:ascii="Segoe UI" w:hAnsi="Segoe UI" w:cs="Segoe UI"/>
+          <w:color w:val="0D0D0D"/>
+          <w:shd w:val="clear" w:color="auto" w:fill="FFFFFF"/>
+          <w:lang w:val="es-ES"/>
+        </w:rPr>
+      </w:pPr>
+      <w:r>
+        <w:rPr>
+          <w:rFonts w:ascii="Segoe UI" w:hAnsi="Segoe UI" w:cs="Segoe UI"/>
+          <w:color w:val="0D0D0D"/>
+          <w:shd w:val="clear" w:color="auto" w:fill="FFFFFF"/>
+          <w:lang w:val="es-ES"/>
+        </w:rPr>
+        <w:t>7)</w:t>
+      </w:r>
+      <w:r>
+        <w:rPr>
+          <w:rFonts w:ascii="Segoe UI" w:hAnsi="Segoe UI" w:cs="Segoe UI"/>
+          <w:color w:val="0D0D0D"/>
+          <w:shd w:val="clear" w:color="auto" w:fill="FFFFFF"/>
+          <w:lang w:val="es-ES"/>
+        </w:rPr>
+        <w:t xml:space="preserve">La practica de pruebas unitarias para métodos, ya que eran pedidas en el entregable </w:t>
       </w:r>
     </w:p>
     <w:p>
@@ -423,7 +612,7 @@
           <w:szCs w:val="22"/>
           <w:lang w:val="es-ES"/>
         </w:rPr>
-        <w:t>Para hacer los diagramas de secuencia y el de clases utilice los documentos de trabajos anteriores</w:t>
+        <w:t>Mayormente trabaje referenciándome en notas de clase</w:t>
       </w:r>
       <w:r>
         <w:rPr>
@@ -433,9 +622,8 @@
           <w:szCs w:val="22"/>
           <w:lang w:val="es-ES"/>
         </w:rPr>
-        <w:t xml:space="preserve">, como lo es batalla naval, con el fin de guiarme en cuanto a estructura y como usaban las herramientas de </w:t>
-      </w:r>
-      <w:proofErr w:type="spellStart"/>
+        <w:t xml:space="preserve">, compañeros e inteligencia artificial sin realizar vibe coding, ya que la utilice principalmente para </w:t>
+      </w:r>
       <w:r>
         <w:rPr>
           <w:rFonts w:ascii="Segoe UI" w:hAnsi="Segoe UI" w:cs="Segoe UI"/>
@@ -444,18 +632,7 @@
           <w:szCs w:val="22"/>
           <w:lang w:val="es-ES"/>
         </w:rPr>
-        <w:t>astah</w:t>
-      </w:r>
-      <w:proofErr w:type="spellEnd"/>
-      <w:r>
-        <w:rPr>
-          <w:rFonts w:ascii="Segoe UI" w:hAnsi="Segoe UI" w:cs="Segoe UI"/>
-          <w:color w:val="0D0D0D"/>
-          <w:sz w:val="22"/>
-          <w:szCs w:val="22"/>
-          <w:lang w:val="es-ES"/>
-        </w:rPr>
-        <w:t xml:space="preserve">. </w:t>
+        <w:t>mejorar las ideas que tenia desde un principio, solo pidiendo recomendaciones mas no cambios</w:t>
       </w:r>
     </w:p>
     <w:p>

</xml_diff>